<commit_message>
chatbot: step 5 apply faq role and menu wording fixes and re-ingest
</commit_message>
<xml_diff>
--- a/backend/chatbot/data/forentrace_faq.docx
+++ b/backend/chatbot/data/forentrace_faq.docx
@@ -374,7 +374,7 @@
           <w:sz w:val="22"/>
           <w:szCs w:val="22"/>
         </w:rPr>
-        <w:t xml:space="preserve">A: Click My Profile at the bottom of the sidebar, then click Change Password. Enter your current password and your new password, then click Save.</w:t>
+        <w:t xml:space="preserve">A: Any user (Admin, Officer or Lab Technician) can click My Profile at the bottom of the sidebar, then click Change Password. Changing the password is not available yet, so please contact the Admin.</w:t>
       </w:r>
     </w:p>
     <w:p>
@@ -404,7 +404,7 @@
           <w:sz w:val="22"/>
           <w:szCs w:val="22"/>
         </w:rPr>
-        <w:t xml:space="preserve">A: Click Sign out at the bottom of the sidebar. Your session ends and you return to the login page.</w:t>
+        <w:t xml:space="preserve">A: Any user (Admin, Officer or Lab Technician) can click Sign out at the bottom of the sidebar. Your session ends and you return to the login page.</w:t>
       </w:r>
     </w:p>
     <w:p>
@@ -704,7 +704,7 @@
           <w:sz w:val="22"/>
           <w:szCs w:val="22"/>
         </w:rPr>
-        <w:t xml:space="preserve">A: ForenTrace supports these sample types: Buccal Swab, Blood Sample, Hair Strand, Bone Sample, Tissue Sample and Personal Belonging.</w:t>
+        <w:t xml:space="preserve">A: ForenTrace supports these sample types: Buccal Swab, Blood Sample, Hair Strand, Bone Sample, Tissue Sample and Personal Belonging. Admins and Officers choose the type in the Sample Type field when they click Register DNA Sample.</w:t>
       </w:r>
     </w:p>
     <w:p>
@@ -824,7 +824,7 @@
           <w:sz w:val="22"/>
           <w:szCs w:val="22"/>
         </w:rPr>
-        <w:t xml:space="preserve">A: Open DNA Matches and click New Comparison, or click Compare on an analyzed evidence sample. Select an Unknown / Evidence Sample and a Matched / Reference Sample, then click Run Comparison. The system compares the two DNA profile codes position by position and shows the similarity percentage and confidence level. Click Save Match to record the result.</w:t>
+        <w:t xml:space="preserve">A: Admins, Officers and Lab Technicians can run a DNA comparison. Open DNA Matches and click New Comparison, or click Compare on an analyzed evidence sample. Select an Unknown / Evidence Sample and a Matched / Reference Sample, then click Run Comparison. The system compares the two DNA profile codes position by position and shows the similarity percentage and confidence level. Click Save Match to record the result.</w:t>
       </w:r>
     </w:p>
     <w:p>
@@ -1034,7 +1034,7 @@
           <w:sz w:val="22"/>
           <w:szCs w:val="22"/>
         </w:rPr>
-        <w:t xml:space="preserve">A: The Admin uses the sidebar pages Police Stations, Police Officers, DNA Labs and Lab Technicians. Each page has an Add button, and each record can be viewed, edited or deleted. Users &amp; Accounts is used to edit, activate or deactivate login accounts.</w:t>
+        <w:t xml:space="preserve">A: The Admin uses the sidebar pages Police Stations, Police Officers, DNA Labs and Lab Technicians. Each page has its own add button (Add Station, Add Officer, Add DNA Lab or Add Technician), and each record can be viewed, edited or deleted. Users &amp; Accounts is used to edit, activate or deactivate login accounts.</w:t>
       </w:r>
     </w:p>
     <w:p>

</xml_diff>

<commit_message>
chatbot: step 6 add bangla question file, apply bangla wording fixes and retry index wait on timeout
</commit_message>
<xml_diff>
--- a/backend/chatbot/data/forentrace_faq.docx
+++ b/backend/chatbot/data/forentrace_faq.docx
@@ -149,7 +149,7 @@
           <w:sz w:val="22"/>
           <w:szCs w:val="22"/>
         </w:rPr>
-        <w:t xml:space="preserve">Q: What can a police officer do? What are a police officer's permissions (duties, tasks)?</w:t>
+        <w:t xml:space="preserve">Q: What can a police officer (investigating officer) do? What are a police officer's permissions (duties, tasks)?</w:t>
       </w:r>
     </w:p>
     <w:p>
@@ -299,7 +299,7 @@
           <w:sz w:val="22"/>
           <w:szCs w:val="22"/>
         </w:rPr>
-        <w:t xml:space="preserve">Q: How do I log in (sign in) to ForenTrace?</w:t>
+        <w:t xml:space="preserve">Q: How do I log in (sign in)? How do I log in to ForenTrace?</w:t>
       </w:r>
     </w:p>
     <w:p>
@@ -419,7 +419,7 @@
           <w:sz w:val="22"/>
           <w:szCs w:val="22"/>
         </w:rPr>
-        <w:t xml:space="preserve">Q: How do I register (add, report) a missing person?</w:t>
+        <w:t xml:space="preserve">Q: How do I register (add, report) a missing (lost) person?</w:t>
       </w:r>
     </w:p>
     <w:p>

</xml_diff>